<commit_message>
fix(fe-03): address review round 1
- B1 sessionsLabel ("1 session") in the summary and the Included sessions row
- B2 isDiscountEligible (backend rule) and one discount text for every screen
- B3 block a second registration of a package that already waits for payment
- B4 real 400 "Start date cannot be in the past" under the date field; today read at submit
- M1 prices in integer cents; M2 card loading note; M3 sanitized URL filters
- M4 paymentsApi.ts

Tests: 297 passed in 16 files (11 added), lint, tsc -b and build green.

Co-Authored-By: Claude Opus 5.5 <noreply@anthropic.com>
Claude-Session: https://claude.ai/code/session_012dY14BdCNHi5oMuDrhUi8Y
</commit_message>
<xml_diff>
--- a/docs/audit/FE-03_AI_Audit_Log.docx
+++ b/docs/audit/FE-03_AI_Audit_Log.docx
@@ -710,7 +710,7 @@
         <w:pStyle w:val="ListBullet"/>
       </w:pPr>
       <w:r>
-        <w:t>Discount preview mirrors the backend: MembershipCardServiceImpl.java lines 275 to 289 return 0 for packages of 1 day or less and otherwise the highest discount of an ACTIVE card that has started; SportPackageServiceImpl.java lines 139 to 143 charge price * (100 - discount) / 100 with HALF_UP to 2 decimals. The frontend computes in cents with Math.round, which rounds half up for positive values (TC-FE03-003). The card used is the card in force today, the same day the backend uses, not the package start date.</w:t>
+        <w:t>Discount preview mirrors the backend: MembershipCardServiceImpl.java lines 275 to 289 return 0 for packages of 1 day or less and otherwise the highest discount of an ACTIVE card that has started; SportPackageServiceImpl.java lines 139 to 143 charge price * (100 - discount) / 100 with HALF_UP to 2 decimals. Corrected in review round 1 (M1): the first version computed with float math and claimed to match BigDecimal HALF_UP, which was false (0.35 with 10% gave 0.31, the backend gives 0.32). priceBreakdown now works in integer cents (cents = round(price * 100); finalCents = round(cents * (100 - discount) / 100)), which matches HALF_UP (TC-FE03-003). The card used is the card in force today, the same day the backend uses, not the package start date.</w:t>
       </w:r>
     </w:p>
     <w:p>
@@ -1528,6 +1528,1083 @@
         <w:t>Every changed file (code, Markdown and the text of this docx) was scanned for non ASCII characters: none found.</w:t>
       </w:r>
     </w:p>
+    <w:p>
+      <w:r>
+        <w:br w:type="page"/>
+      </w:r>
+    </w:p>
+    <w:p>
+      <w:pPr>
+        <w:pStyle w:val="Heading1"/>
+      </w:pPr>
+      <w:r>
+        <w:t>8. Review round 1</w:t>
+      </w:r>
+    </w:p>
+    <w:p>
+      <w:r>
+        <w:t>Base: commit 58d737a. Fast mode: self-review, then lint, tsc -b, test and build once. Result: 297 tests pass in 16 files (11 added); lint 0 warnings; tsc -b and build pass.</w:t>
+      </w:r>
+    </w:p>
+    <w:tbl>
+      <w:tblPr>
+        <w:tblStyle w:val="LightGrid-Accent1"/>
+        <w:tblW w:type="auto" w:w="0"/>
+        <w:jc w:val="center"/>
+        <w:tblLook w:firstColumn="1" w:firstRow="1" w:lastColumn="0" w:lastRow="0" w:noHBand="0" w:noVBand="1" w:val="04A0"/>
+      </w:tblPr>
+      <w:tblGrid>
+        <w:gridCol w:w="2160"/>
+        <w:gridCol w:w="2160"/>
+        <w:gridCol w:w="2160"/>
+        <w:gridCol w:w="2160"/>
+      </w:tblGrid>
+      <w:tr>
+        <w:tc>
+          <w:tcPr>
+            <w:tcW w:type="dxa" w:w="2160"/>
+          </w:tcPr>
+          <w:p>
+            <w:r>
+              <w:rPr>
+                <w:b/>
+                <w:sz w:val="18"/>
+              </w:rPr>
+              <w:t>ID</w:t>
+            </w:r>
+          </w:p>
+        </w:tc>
+        <w:tc>
+          <w:tcPr>
+            <w:tcW w:type="dxa" w:w="2160"/>
+          </w:tcPr>
+          <w:p>
+            <w:r>
+              <w:rPr>
+                <w:b/>
+                <w:sz w:val="18"/>
+              </w:rPr>
+              <w:t>What changed</w:t>
+            </w:r>
+          </w:p>
+        </w:tc>
+        <w:tc>
+          <w:tcPr>
+            <w:tcW w:type="dxa" w:w="2160"/>
+          </w:tcPr>
+          <w:p>
+            <w:r>
+              <w:rPr>
+                <w:b/>
+                <w:sz w:val="18"/>
+              </w:rPr>
+              <w:t>Files</w:t>
+            </w:r>
+          </w:p>
+        </w:tc>
+        <w:tc>
+          <w:tcPr>
+            <w:tcW w:type="dxa" w:w="2160"/>
+          </w:tcPr>
+          <w:p>
+            <w:r>
+              <w:rPr>
+                <w:b/>
+                <w:sz w:val="18"/>
+              </w:rPr>
+              <w:t>Tests</w:t>
+            </w:r>
+          </w:p>
+        </w:tc>
+      </w:tr>
+      <w:tr>
+        <w:tc>
+          <w:tcPr>
+            <w:tcW w:type="dxa" w:w="2160"/>
+          </w:tcPr>
+          <w:p>
+            <w:r>
+              <w:rPr>
+                <w:sz w:val="18"/>
+              </w:rPr>
+              <w:t>B1</w:t>
+            </w:r>
+          </w:p>
+        </w:tc>
+        <w:tc>
+          <w:tcPr>
+            <w:tcW w:type="dxa" w:w="2160"/>
+          </w:tcPr>
+          <w:p>
+            <w:r>
+              <w:rPr>
+                <w:sz w:val="18"/>
+              </w:rPr>
+              <w:t>New sessionsLabel(count): "No session limit" for null and undefined, "1 session", "N sessions". Used by packageSummary and the Included sessions row.</w:t>
+            </w:r>
+          </w:p>
+        </w:tc>
+        <w:tc>
+          <w:tcPr>
+            <w:tcW w:type="dxa" w:w="2160"/>
+          </w:tcPr>
+          <w:p>
+            <w:r>
+              <w:rPr>
+                <w:sz w:val="18"/>
+              </w:rPr>
+              <w:t>packagesModel.ts, PackageDetailPage.tsx</w:t>
+            </w:r>
+          </w:p>
+        </w:tc>
+        <w:tc>
+          <w:tcPr>
+            <w:tcW w:type="dxa" w:w="2160"/>
+          </w:tcPr>
+          <w:p>
+            <w:r>
+              <w:rPr>
+                <w:sz w:val="18"/>
+              </w:rPr>
+              <w:t>TC-FE03-008, TC-FE03-042</w:t>
+            </w:r>
+          </w:p>
+        </w:tc>
+      </w:tr>
+      <w:tr>
+        <w:tc>
+          <w:tcPr>
+            <w:tcW w:type="dxa" w:w="2160"/>
+          </w:tcPr>
+          <w:p>
+            <w:r>
+              <w:rPr>
+                <w:sz w:val="18"/>
+              </w:rPr>
+              <w:t>B2</w:t>
+            </w:r>
+          </w:p>
+        </w:tc>
+        <w:tc>
+          <w:tcPr>
+            <w:tcW w:type="dxa" w:w="2160"/>
+          </w:tcPr>
+          <w:p>
+            <w:r>
+              <w:rPr>
+                <w:sz w:val="18"/>
+              </w:rPr>
+              <w:t>New isDiscountEligible(durationDays) (durationDays &gt; 1, the backend rule) used by discountPercentFor. cardDiscountText now says "&lt;n&gt;% off packages longer than a single visit", so the dashboard hint, the first-package hero and the list note state the rule the prices use. The docs (30-day and 90-day only) vs code mismatch stays an open question.</w:t>
+            </w:r>
+          </w:p>
+        </w:tc>
+        <w:tc>
+          <w:tcPr>
+            <w:tcW w:type="dxa" w:w="2160"/>
+          </w:tcPr>
+          <w:p>
+            <w:r>
+              <w:rPr>
+                <w:sz w:val="18"/>
+              </w:rPr>
+              <w:t>packagesModel.ts, dashboardModel.ts</w:t>
+            </w:r>
+          </w:p>
+        </w:tc>
+        <w:tc>
+          <w:tcPr>
+            <w:tcW w:type="dxa" w:w="2160"/>
+          </w:tcPr>
+          <w:p>
+            <w:r>
+              <w:rPr>
+                <w:sz w:val="18"/>
+              </w:rPr>
+              <w:t>TC-FE03-009, TC-FE03-043, TC-FE03-013 (text), FE-02 TC-FE02-021, TC-FE02-122, TC-FE02-126, TC-FE02-127 (text)</w:t>
+            </w:r>
+          </w:p>
+        </w:tc>
+      </w:tr>
+      <w:tr>
+        <w:tc>
+          <w:tcPr>
+            <w:tcW w:type="dxa" w:w="2160"/>
+          </w:tcPr>
+          <w:p>
+            <w:r>
+              <w:rPr>
+                <w:sz w:val="18"/>
+              </w:rPr>
+              <w:t>B3</w:t>
+            </w:r>
+          </w:p>
+        </w:tc>
+        <w:tc>
+          <w:tcPr>
+            <w:tcW w:type="dxa" w:w="2160"/>
+          </w:tcPr>
+          <w:p>
+            <w:r>
+              <w:rPr>
+                <w:sz w:val="18"/>
+              </w:rPr>
+              <w:t>The detail page also loads GET /packages/registrations/my. A PENDING_PAYMENT registration of the same package shows "You already have a registration waiting for payment for this package" with Continue to payment (or pay at the front desk) and disables Confirm and the date. A load failure blocks nothing.</w:t>
+            </w:r>
+          </w:p>
+        </w:tc>
+        <w:tc>
+          <w:tcPr>
+            <w:tcW w:type="dxa" w:w="2160"/>
+          </w:tcPr>
+          <w:p>
+            <w:r>
+              <w:rPr>
+                <w:sz w:val="18"/>
+              </w:rPr>
+              <w:t>PackageDetailPage.tsx</w:t>
+            </w:r>
+          </w:p>
+        </w:tc>
+        <w:tc>
+          <w:tcPr>
+            <w:tcW w:type="dxa" w:w="2160"/>
+          </w:tcPr>
+          <w:p>
+            <w:r>
+              <w:rPr>
+                <w:sz w:val="18"/>
+              </w:rPr>
+              <w:t>TC-FE03-044, TC-FE03-045, TC-FE03-046</w:t>
+            </w:r>
+          </w:p>
+        </w:tc>
+      </w:tr>
+      <w:tr>
+        <w:tc>
+          <w:tcPr>
+            <w:tcW w:type="dxa" w:w="2160"/>
+          </w:tcPr>
+          <w:p>
+            <w:r>
+              <w:rPr>
+                <w:sz w:val="18"/>
+              </w:rPr>
+              <w:t>B4</w:t>
+            </w:r>
+          </w:p>
+        </w:tc>
+        <w:tc>
+          <w:tcPr>
+            <w:tcW w:type="dxa" w:w="2160"/>
+          </w:tcPr>
+          <w:p>
+            <w:r>
+              <w:rPr>
+                <w:sz w:val="18"/>
+              </w:rPr>
+              <w:t>(a) A 400 without details whose message is START_DATE_IN_PAST goes under the date field and focuses it. (b) TC-FE03-039 uses the real shape: GlobalExceptionHandler.handleBusinessRuleException (lines 67 to 70) returns 400 with {timestamp, status, message} and no details (buildErrorResponse, lines 125 to 134). (c) Today is read at submit for validation and on focus and change for the picker min.</w:t>
+            </w:r>
+          </w:p>
+        </w:tc>
+        <w:tc>
+          <w:tcPr>
+            <w:tcW w:type="dxa" w:w="2160"/>
+          </w:tcPr>
+          <w:p>
+            <w:r>
+              <w:rPr>
+                <w:sz w:val="18"/>
+              </w:rPr>
+              <w:t>PackageDetailPage.tsx, packagesModel.ts</w:t>
+            </w:r>
+          </w:p>
+        </w:tc>
+        <w:tc>
+          <w:tcPr>
+            <w:tcW w:type="dxa" w:w="2160"/>
+          </w:tcPr>
+          <w:p>
+            <w:r>
+              <w:rPr>
+                <w:sz w:val="18"/>
+              </w:rPr>
+              <w:t>TC-FE03-039 (rewritten), TC-FE03-047</w:t>
+            </w:r>
+          </w:p>
+        </w:tc>
+      </w:tr>
+      <w:tr>
+        <w:tc>
+          <w:tcPr>
+            <w:tcW w:type="dxa" w:w="2160"/>
+          </w:tcPr>
+          <w:p>
+            <w:r>
+              <w:rPr>
+                <w:sz w:val="18"/>
+              </w:rPr>
+              <w:t>M1</w:t>
+            </w:r>
+          </w:p>
+        </w:tc>
+        <w:tc>
+          <w:tcPr>
+            <w:tcW w:type="dxa" w:w="2160"/>
+          </w:tcPr>
+          <w:p>
+            <w:r>
+              <w:rPr>
+                <w:sz w:val="18"/>
+              </w:rPr>
+              <w:t>priceBreakdown in integer cents; comment and section 3 corrected.</w:t>
+            </w:r>
+          </w:p>
+        </w:tc>
+        <w:tc>
+          <w:tcPr>
+            <w:tcW w:type="dxa" w:w="2160"/>
+          </w:tcPr>
+          <w:p>
+            <w:r>
+              <w:rPr>
+                <w:sz w:val="18"/>
+              </w:rPr>
+              <w:t>packagesModel.ts</w:t>
+            </w:r>
+          </w:p>
+        </w:tc>
+        <w:tc>
+          <w:tcPr>
+            <w:tcW w:type="dxa" w:w="2160"/>
+          </w:tcPr>
+          <w:p>
+            <w:r>
+              <w:rPr>
+                <w:sz w:val="18"/>
+              </w:rPr>
+              <w:t>TC-FE03-003 (0.35 VIP -&gt; 0.32, 2.30 GOLD -&gt; 2.19)</w:t>
+            </w:r>
+          </w:p>
+        </w:tc>
+      </w:tr>
+      <w:tr>
+        <w:tc>
+          <w:tcPr>
+            <w:tcW w:type="dxa" w:w="2160"/>
+          </w:tcPr>
+          <w:p>
+            <w:r>
+              <w:rPr>
+                <w:sz w:val="18"/>
+              </w:rPr>
+              <w:t>M2</w:t>
+            </w:r>
+          </w:p>
+        </w:tc>
+        <w:tc>
+          <w:tcPr>
+            <w:tcW w:type="dxa" w:w="2160"/>
+          </w:tcPr>
+          <w:p>
+            <w:r>
+              <w:rPr>
+                <w:sz w:val="18"/>
+              </w:rPr>
+              <w:t>While the cards load, eligible package cards show "Checking your card discount" instead of "Original price".</w:t>
+            </w:r>
+          </w:p>
+        </w:tc>
+        <w:tc>
+          <w:tcPr>
+            <w:tcW w:type="dxa" w:w="2160"/>
+          </w:tcPr>
+          <w:p>
+            <w:r>
+              <w:rPr>
+                <w:sz w:val="18"/>
+              </w:rPr>
+              <w:t>SportPackagesPage.tsx</w:t>
+            </w:r>
+          </w:p>
+        </w:tc>
+        <w:tc>
+          <w:tcPr>
+            <w:tcW w:type="dxa" w:w="2160"/>
+          </w:tcPr>
+          <w:p>
+            <w:r>
+              <w:rPr>
+                <w:sz w:val="18"/>
+              </w:rPr>
+              <w:t>TC-FE03-048</w:t>
+            </w:r>
+          </w:p>
+        </w:tc>
+      </w:tr>
+      <w:tr>
+        <w:tc>
+          <w:tcPr>
+            <w:tcW w:type="dxa" w:w="2160"/>
+          </w:tcPr>
+          <w:p>
+            <w:r>
+              <w:rPr>
+                <w:sz w:val="18"/>
+              </w:rPr>
+              <w:t>M3</w:t>
+            </w:r>
+          </w:p>
+        </w:tc>
+        <w:tc>
+          <w:tcPr>
+            <w:tcW w:type="dxa" w:w="2160"/>
+          </w:tcPr>
+          <w:p>
+            <w:r>
+              <w:rPr>
+                <w:sz w:val="18"/>
+              </w:rPr>
+              <w:t>sanitizeFilters drops a sport id that is not a known sport, a format not in FORMAT_FILTER_OPTIONS and a duration not in durationOptions; links use the sanitized query.</w:t>
+            </w:r>
+          </w:p>
+        </w:tc>
+        <w:tc>
+          <w:tcPr>
+            <w:tcW w:type="dxa" w:w="2160"/>
+          </w:tcPr>
+          <w:p>
+            <w:r>
+              <w:rPr>
+                <w:sz w:val="18"/>
+              </w:rPr>
+              <w:t>packagesModel.ts, SportPackagesPage.tsx</w:t>
+            </w:r>
+          </w:p>
+        </w:tc>
+        <w:tc>
+          <w:tcPr>
+            <w:tcW w:type="dxa" w:w="2160"/>
+          </w:tcPr>
+          <w:p>
+            <w:r>
+              <w:rPr>
+                <w:sz w:val="18"/>
+              </w:rPr>
+              <w:t>TC-FE03-020, TC-FE03-049</w:t>
+            </w:r>
+          </w:p>
+        </w:tc>
+      </w:tr>
+      <w:tr>
+        <w:tc>
+          <w:tcPr>
+            <w:tcW w:type="dxa" w:w="2160"/>
+          </w:tcPr>
+          <w:p>
+            <w:r>
+              <w:rPr>
+                <w:sz w:val="18"/>
+              </w:rPr>
+              <w:t>M4</w:t>
+            </w:r>
+          </w:p>
+        </w:tc>
+        <w:tc>
+          <w:tcPr>
+            <w:tcW w:type="dxa" w:w="2160"/>
+          </w:tcPr>
+          <w:p>
+            <w:r>
+              <w:rPr>
+                <w:sz w:val="18"/>
+              </w:rPr>
+              <w:t>payment() and the Payment and BankTransferInstructions types moved to the new src/api/paymentsApi.ts; imports updated.</w:t>
+            </w:r>
+          </w:p>
+        </w:tc>
+        <w:tc>
+          <w:tcPr>
+            <w:tcW w:type="dxa" w:w="2160"/>
+          </w:tcPr>
+          <w:p>
+            <w:r>
+              <w:rPr>
+                <w:sz w:val="18"/>
+              </w:rPr>
+              <w:t>paymentsApi.ts (new), packagesApi.ts, PaymentSummaryPage.tsx, memberFixtures.ts</w:t>
+            </w:r>
+          </w:p>
+        </w:tc>
+        <w:tc>
+          <w:tcPr>
+            <w:tcW w:type="dxa" w:w="2160"/>
+          </w:tcPr>
+          <w:p>
+            <w:r>
+              <w:rPr>
+                <w:sz w:val="18"/>
+              </w:rPr>
+              <w:t>Existing payment tests TC-FE03-036, TC-FE03-050, TC-FE03-051</w:t>
+            </w:r>
+          </w:p>
+        </w:tc>
+      </w:tr>
+      <w:tr>
+        <w:tc>
+          <w:tcPr>
+            <w:tcW w:type="dxa" w:w="2160"/>
+          </w:tcPr>
+          <w:p>
+            <w:r>
+              <w:rPr>
+                <w:sz w:val="18"/>
+              </w:rPr>
+              <w:t>M5</w:t>
+            </w:r>
+          </w:p>
+        </w:tc>
+        <w:tc>
+          <w:tcPr>
+            <w:tcW w:type="dxa" w:w="2160"/>
+          </w:tcPr>
+          <w:p>
+            <w:r>
+              <w:rPr>
+                <w:sz w:val="18"/>
+              </w:rPr>
+              <w:t>Commit "fix(fe-03): address review round 1" uses the PR scope.</w:t>
+            </w:r>
+          </w:p>
+        </w:tc>
+        <w:tc>
+          <w:tcPr>
+            <w:tcW w:type="dxa" w:w="2160"/>
+          </w:tcPr>
+          <w:p>
+            <w:r>
+              <w:rPr>
+                <w:sz w:val="18"/>
+              </w:rPr>
+              <w:t>-</w:t>
+            </w:r>
+          </w:p>
+        </w:tc>
+        <w:tc>
+          <w:tcPr>
+            <w:tcW w:type="dxa" w:w="2160"/>
+          </w:tcPr>
+          <w:p>
+            <w:r>
+              <w:rPr>
+                <w:sz w:val="18"/>
+              </w:rPr>
+              <w:t>-</w:t>
+            </w:r>
+          </w:p>
+        </w:tc>
+      </w:tr>
+    </w:tbl>
+    <w:p/>
+    <w:p>
+      <w:pPr>
+        <w:pStyle w:val="Heading2"/>
+      </w:pPr>
+      <w:r>
+        <w:t>8.1 Files changed in review round 1</w:t>
+      </w:r>
+    </w:p>
+    <w:tbl>
+      <w:tblPr>
+        <w:tblStyle w:val="LightGrid-Accent1"/>
+        <w:tblW w:type="auto" w:w="0"/>
+        <w:jc w:val="center"/>
+        <w:tblLook w:firstColumn="1" w:firstRow="1" w:lastColumn="0" w:lastRow="0" w:noHBand="0" w:noVBand="1" w:val="04A0"/>
+      </w:tblPr>
+      <w:tblGrid>
+        <w:gridCol w:w="4320"/>
+        <w:gridCol w:w="4320"/>
+      </w:tblGrid>
+      <w:tr>
+        <w:tc>
+          <w:tcPr>
+            <w:tcW w:type="dxa" w:w="4320"/>
+          </w:tcPr>
+          <w:p>
+            <w:r>
+              <w:rPr>
+                <w:b/>
+                <w:sz w:val="18"/>
+              </w:rPr>
+              <w:t>Path</w:t>
+            </w:r>
+          </w:p>
+        </w:tc>
+        <w:tc>
+          <w:tcPr>
+            <w:tcW w:type="dxa" w:w="4320"/>
+          </w:tcPr>
+          <w:p>
+            <w:r>
+              <w:rPr>
+                <w:b/>
+                <w:sz w:val="18"/>
+              </w:rPr>
+              <w:t>Change</w:t>
+            </w:r>
+          </w:p>
+        </w:tc>
+      </w:tr>
+      <w:tr>
+        <w:tc>
+          <w:tcPr>
+            <w:tcW w:type="dxa" w:w="4320"/>
+          </w:tcPr>
+          <w:p>
+            <w:r>
+              <w:rPr>
+                <w:sz w:val="18"/>
+              </w:rPr>
+              <w:t>CHANGELOG.md</w:t>
+            </w:r>
+          </w:p>
+        </w:tc>
+        <w:tc>
+          <w:tcPr>
+            <w:tcW w:type="dxa" w:w="4320"/>
+          </w:tcPr>
+          <w:p>
+            <w:r>
+              <w:rPr>
+                <w:sz w:val="18"/>
+              </w:rPr>
+              <w:t>Modified: Review round 1 lines under FE-03</w:t>
+            </w:r>
+          </w:p>
+        </w:tc>
+      </w:tr>
+      <w:tr>
+        <w:tc>
+          <w:tcPr>
+            <w:tcW w:type="dxa" w:w="4320"/>
+          </w:tcPr>
+          <w:p>
+            <w:r>
+              <w:rPr>
+                <w:sz w:val="18"/>
+              </w:rPr>
+              <w:t>docs/audit/FE-03_AI_Audit_Log.docx</w:t>
+            </w:r>
+          </w:p>
+        </w:tc>
+        <w:tc>
+          <w:tcPr>
+            <w:tcW w:type="dxa" w:w="4320"/>
+          </w:tcPr>
+          <w:p>
+            <w:r>
+              <w:rPr>
+                <w:sz w:val="18"/>
+              </w:rPr>
+              <w:t>Modified: section 3 corrected, section 8 added</w:t>
+            </w:r>
+          </w:p>
+        </w:tc>
+      </w:tr>
+      <w:tr>
+        <w:tc>
+          <w:tcPr>
+            <w:tcW w:type="dxa" w:w="4320"/>
+          </w:tcPr>
+          <w:p>
+            <w:r>
+              <w:rPr>
+                <w:sz w:val="18"/>
+              </w:rPr>
+              <w:t>docs/tests/FE-03_test_cases.md</w:t>
+            </w:r>
+          </w:p>
+        </w:tc>
+        <w:tc>
+          <w:tcPr>
+            <w:tcW w:type="dxa" w:w="4320"/>
+          </w:tcPr>
+          <w:p>
+            <w:r>
+              <w:rPr>
+                <w:sz w:val="18"/>
+              </w:rPr>
+              <w:t>Modified</w:t>
+            </w:r>
+          </w:p>
+        </w:tc>
+      </w:tr>
+      <w:tr>
+        <w:tc>
+          <w:tcPr>
+            <w:tcW w:type="dxa" w:w="4320"/>
+          </w:tcPr>
+          <w:p>
+            <w:r>
+              <w:rPr>
+                <w:sz w:val="18"/>
+              </w:rPr>
+              <w:t>frontend/src/api/paymentsApi.ts</w:t>
+            </w:r>
+          </w:p>
+        </w:tc>
+        <w:tc>
+          <w:tcPr>
+            <w:tcW w:type="dxa" w:w="4320"/>
+          </w:tcPr>
+          <w:p>
+            <w:r>
+              <w:rPr>
+                <w:sz w:val="18"/>
+              </w:rPr>
+              <w:t>New</w:t>
+            </w:r>
+          </w:p>
+        </w:tc>
+      </w:tr>
+      <w:tr>
+        <w:tc>
+          <w:tcPr>
+            <w:tcW w:type="dxa" w:w="4320"/>
+          </w:tcPr>
+          <w:p>
+            <w:r>
+              <w:rPr>
+                <w:sz w:val="18"/>
+              </w:rPr>
+              <w:t>frontend/src/api/packagesApi.ts</w:t>
+            </w:r>
+          </w:p>
+        </w:tc>
+        <w:tc>
+          <w:tcPr>
+            <w:tcW w:type="dxa" w:w="4320"/>
+          </w:tcPr>
+          <w:p>
+            <w:r>
+              <w:rPr>
+                <w:sz w:val="18"/>
+              </w:rPr>
+              <w:t>Modified</w:t>
+            </w:r>
+          </w:p>
+        </w:tc>
+      </w:tr>
+      <w:tr>
+        <w:tc>
+          <w:tcPr>
+            <w:tcW w:type="dxa" w:w="4320"/>
+          </w:tcPr>
+          <w:p>
+            <w:r>
+              <w:rPr>
+                <w:sz w:val="18"/>
+              </w:rPr>
+              <w:t>frontend/src/pages/member/packagesModel.ts</w:t>
+            </w:r>
+          </w:p>
+        </w:tc>
+        <w:tc>
+          <w:tcPr>
+            <w:tcW w:type="dxa" w:w="4320"/>
+          </w:tcPr>
+          <w:p>
+            <w:r>
+              <w:rPr>
+                <w:sz w:val="18"/>
+              </w:rPr>
+              <w:t>Modified</w:t>
+            </w:r>
+          </w:p>
+        </w:tc>
+      </w:tr>
+      <w:tr>
+        <w:tc>
+          <w:tcPr>
+            <w:tcW w:type="dxa" w:w="4320"/>
+          </w:tcPr>
+          <w:p>
+            <w:r>
+              <w:rPr>
+                <w:sz w:val="18"/>
+              </w:rPr>
+              <w:t>frontend/src/pages/member/packagesModel.test.ts</w:t>
+            </w:r>
+          </w:p>
+        </w:tc>
+        <w:tc>
+          <w:tcPr>
+            <w:tcW w:type="dxa" w:w="4320"/>
+          </w:tcPr>
+          <w:p>
+            <w:r>
+              <w:rPr>
+                <w:sz w:val="18"/>
+              </w:rPr>
+              <w:t>Modified</w:t>
+            </w:r>
+          </w:p>
+        </w:tc>
+      </w:tr>
+      <w:tr>
+        <w:tc>
+          <w:tcPr>
+            <w:tcW w:type="dxa" w:w="4320"/>
+          </w:tcPr>
+          <w:p>
+            <w:r>
+              <w:rPr>
+                <w:sz w:val="18"/>
+              </w:rPr>
+              <w:t>frontend/src/pages/member/SportPackagesPage.tsx</w:t>
+            </w:r>
+          </w:p>
+        </w:tc>
+        <w:tc>
+          <w:tcPr>
+            <w:tcW w:type="dxa" w:w="4320"/>
+          </w:tcPr>
+          <w:p>
+            <w:r>
+              <w:rPr>
+                <w:sz w:val="18"/>
+              </w:rPr>
+              <w:t>Modified</w:t>
+            </w:r>
+          </w:p>
+        </w:tc>
+      </w:tr>
+      <w:tr>
+        <w:tc>
+          <w:tcPr>
+            <w:tcW w:type="dxa" w:w="4320"/>
+          </w:tcPr>
+          <w:p>
+            <w:r>
+              <w:rPr>
+                <w:sz w:val="18"/>
+              </w:rPr>
+              <w:t>frontend/src/pages/member/PackageDetailPage.tsx</w:t>
+            </w:r>
+          </w:p>
+        </w:tc>
+        <w:tc>
+          <w:tcPr>
+            <w:tcW w:type="dxa" w:w="4320"/>
+          </w:tcPr>
+          <w:p>
+            <w:r>
+              <w:rPr>
+                <w:sz w:val="18"/>
+              </w:rPr>
+              <w:t>Modified</w:t>
+            </w:r>
+          </w:p>
+        </w:tc>
+      </w:tr>
+      <w:tr>
+        <w:tc>
+          <w:tcPr>
+            <w:tcW w:type="dxa" w:w="4320"/>
+          </w:tcPr>
+          <w:p>
+            <w:r>
+              <w:rPr>
+                <w:sz w:val="18"/>
+              </w:rPr>
+              <w:t>frontend/src/pages/member/PaymentSummaryPage.tsx</w:t>
+            </w:r>
+          </w:p>
+        </w:tc>
+        <w:tc>
+          <w:tcPr>
+            <w:tcW w:type="dxa" w:w="4320"/>
+          </w:tcPr>
+          <w:p>
+            <w:r>
+              <w:rPr>
+                <w:sz w:val="18"/>
+              </w:rPr>
+              <w:t>Modified</w:t>
+            </w:r>
+          </w:p>
+        </w:tc>
+      </w:tr>
+      <w:tr>
+        <w:tc>
+          <w:tcPr>
+            <w:tcW w:type="dxa" w:w="4320"/>
+          </w:tcPr>
+          <w:p>
+            <w:r>
+              <w:rPr>
+                <w:sz w:val="18"/>
+              </w:rPr>
+              <w:t>frontend/src/pages/member/sportPackages.test.tsx</w:t>
+            </w:r>
+          </w:p>
+        </w:tc>
+        <w:tc>
+          <w:tcPr>
+            <w:tcW w:type="dxa" w:w="4320"/>
+          </w:tcPr>
+          <w:p>
+            <w:r>
+              <w:rPr>
+                <w:sz w:val="18"/>
+              </w:rPr>
+              <w:t>Modified</w:t>
+            </w:r>
+          </w:p>
+        </w:tc>
+      </w:tr>
+      <w:tr>
+        <w:tc>
+          <w:tcPr>
+            <w:tcW w:type="dxa" w:w="4320"/>
+          </w:tcPr>
+          <w:p>
+            <w:r>
+              <w:rPr>
+                <w:sz w:val="18"/>
+              </w:rPr>
+              <w:t>frontend/src/pages/member/dashboardModel.ts</w:t>
+            </w:r>
+          </w:p>
+        </w:tc>
+        <w:tc>
+          <w:tcPr>
+            <w:tcW w:type="dxa" w:w="4320"/>
+          </w:tcPr>
+          <w:p>
+            <w:r>
+              <w:rPr>
+                <w:sz w:val="18"/>
+              </w:rPr>
+              <w:t>Modified: cardDiscountText</w:t>
+            </w:r>
+          </w:p>
+        </w:tc>
+      </w:tr>
+      <w:tr>
+        <w:tc>
+          <w:tcPr>
+            <w:tcW w:type="dxa" w:w="4320"/>
+          </w:tcPr>
+          <w:p>
+            <w:r>
+              <w:rPr>
+                <w:sz w:val="18"/>
+              </w:rPr>
+              <w:t>frontend/src/pages/member/dashboardModel.test.ts</w:t>
+            </w:r>
+          </w:p>
+        </w:tc>
+        <w:tc>
+          <w:tcPr>
+            <w:tcW w:type="dxa" w:w="4320"/>
+          </w:tcPr>
+          <w:p>
+            <w:r>
+              <w:rPr>
+                <w:sz w:val="18"/>
+              </w:rPr>
+              <w:t>Modified</w:t>
+            </w:r>
+          </w:p>
+        </w:tc>
+      </w:tr>
+      <w:tr>
+        <w:tc>
+          <w:tcPr>
+            <w:tcW w:type="dxa" w:w="4320"/>
+          </w:tcPr>
+          <w:p>
+            <w:r>
+              <w:rPr>
+                <w:sz w:val="18"/>
+              </w:rPr>
+              <w:t>frontend/src/pages/member/memberDashboard.test.tsx</w:t>
+            </w:r>
+          </w:p>
+        </w:tc>
+        <w:tc>
+          <w:tcPr>
+            <w:tcW w:type="dxa" w:w="4320"/>
+          </w:tcPr>
+          <w:p>
+            <w:r>
+              <w:rPr>
+                <w:sz w:val="18"/>
+              </w:rPr>
+              <w:t>Modified</w:t>
+            </w:r>
+          </w:p>
+        </w:tc>
+      </w:tr>
+      <w:tr>
+        <w:tc>
+          <w:tcPr>
+            <w:tcW w:type="dxa" w:w="4320"/>
+          </w:tcPr>
+          <w:p>
+            <w:r>
+              <w:rPr>
+                <w:sz w:val="18"/>
+              </w:rPr>
+              <w:t>frontend/src/test/memberFixtures.ts</w:t>
+            </w:r>
+          </w:p>
+        </w:tc>
+        <w:tc>
+          <w:tcPr>
+            <w:tcW w:type="dxa" w:w="4320"/>
+          </w:tcPr>
+          <w:p>
+            <w:r>
+              <w:rPr>
+                <w:sz w:val="18"/>
+              </w:rPr>
+              <w:t>Modified</w:t>
+            </w:r>
+          </w:p>
+        </w:tc>
+      </w:tr>
+    </w:tbl>
+    <w:p/>
+    <w:p>
+      <w:pPr>
+        <w:pStyle w:val="Heading2"/>
+      </w:pPr>
+      <w:r>
+        <w:t>8.2 Open questions</w:t>
+      </w:r>
+    </w:p>
+    <w:p>
+      <w:pPr>
+        <w:pStyle w:val="ListBullet"/>
+      </w:pPr>
+      <w:r>
+        <w:t>Discount rule: docs/database/09 lines 149 to 153 say 30-day and 90-day packages only; MembershipCardServiceImpl lines 275 to 279 exclude only packages of 1 day or less. The UI follows the code so the text never contradicts the price.</w:t>
+      </w:r>
+    </w:p>
+    <w:p>
+      <w:pPr>
+        <w:pStyle w:val="ListBullet"/>
+      </w:pPr>
+      <w:r>
+        <w:t>Duplicate pending registrations: the frontend now blocks the same package, but the backend should also reject a second PENDING_PAYMENT registration of the same package (cards already have this rule).</w:t>
+      </w:r>
+    </w:p>
+    <w:p>
+      <w:r>
+        <w:t>Character scan of every changed file (code, Markdown and this docx): no non ASCII characters.</w:t>
+      </w:r>
+    </w:p>
     <w:sectPr>
       <w:pgSz w:w="12240" w:h="15840"/>
       <w:pgMar w:top="1440" w:right="1800" w:bottom="1440" w:left="1800" w:header="720" w:footer="720" w:gutter="0"/>

</xml_diff>

<commit_message>
fix(fe-03): address review round 2
- B3b Confirm registration waits for the registrations list; no submit while it loads
- N1 discount-eligible prices show "-" while the member card loads

Tests: 298 passed in 16 files (1 added), lint, tsc -b and build green.

Co-Authored-By: Claude Opus 5.5 <noreply@anthropic.com>
Claude-Session: https://claude.ai/code/session_012dY14BdCNHi5oMuDrhUi8Y
</commit_message>
<xml_diff>
--- a/docs/audit/FE-03_AI_Audit_Log.docx
+++ b/docs/audit/FE-03_AI_Audit_Log.docx
@@ -2605,6 +2605,511 @@
         <w:t>Character scan of every changed file (code, Markdown and this docx): no non ASCII characters.</w:t>
       </w:r>
     </w:p>
+    <w:p>
+      <w:r>
+        <w:br w:type="page"/>
+      </w:r>
+    </w:p>
+    <w:p>
+      <w:pPr>
+        <w:pStyle w:val="Heading1"/>
+      </w:pPr>
+      <w:r>
+        <w:t>9. Review round 2</w:t>
+      </w:r>
+    </w:p>
+    <w:p>
+      <w:r>
+        <w:t>Fast mode: self-review, then lint, tsc -b, test and build once. Result: 298 tests pass in 16 files (1 added); lint 0 warnings; tsc -b and build pass.</w:t>
+      </w:r>
+    </w:p>
+    <w:tbl>
+      <w:tblPr>
+        <w:tblStyle w:val="LightGrid-Accent1"/>
+        <w:tblW w:type="auto" w:w="0"/>
+        <w:jc w:val="center"/>
+        <w:tblLook w:firstColumn="1" w:firstRow="1" w:lastColumn="0" w:lastRow="0" w:noHBand="0" w:noVBand="1" w:val="04A0"/>
+      </w:tblPr>
+      <w:tblGrid>
+        <w:gridCol w:w="2160"/>
+        <w:gridCol w:w="2160"/>
+        <w:gridCol w:w="2160"/>
+        <w:gridCol w:w="2160"/>
+      </w:tblGrid>
+      <w:tr>
+        <w:tc>
+          <w:tcPr>
+            <w:tcW w:type="dxa" w:w="2160"/>
+          </w:tcPr>
+          <w:p>
+            <w:r>
+              <w:rPr>
+                <w:b/>
+                <w:sz w:val="18"/>
+              </w:rPr>
+              <w:t>ID</w:t>
+            </w:r>
+          </w:p>
+        </w:tc>
+        <w:tc>
+          <w:tcPr>
+            <w:tcW w:type="dxa" w:w="2160"/>
+          </w:tcPr>
+          <w:p>
+            <w:r>
+              <w:rPr>
+                <w:b/>
+                <w:sz w:val="18"/>
+              </w:rPr>
+              <w:t>What changed</w:t>
+            </w:r>
+          </w:p>
+        </w:tc>
+        <w:tc>
+          <w:tcPr>
+            <w:tcW w:type="dxa" w:w="2160"/>
+          </w:tcPr>
+          <w:p>
+            <w:r>
+              <w:rPr>
+                <w:b/>
+                <w:sz w:val="18"/>
+              </w:rPr>
+              <w:t>Files</w:t>
+            </w:r>
+          </w:p>
+        </w:tc>
+        <w:tc>
+          <w:tcPr>
+            <w:tcW w:type="dxa" w:w="2160"/>
+          </w:tcPr>
+          <w:p>
+            <w:r>
+              <w:rPr>
+                <w:b/>
+                <w:sz w:val="18"/>
+              </w:rPr>
+              <w:t>Tests</w:t>
+            </w:r>
+          </w:p>
+        </w:tc>
+      </w:tr>
+      <w:tr>
+        <w:tc>
+          <w:tcPr>
+            <w:tcW w:type="dxa" w:w="2160"/>
+          </w:tcPr>
+          <w:p>
+            <w:r>
+              <w:rPr>
+                <w:sz w:val="18"/>
+              </w:rPr>
+              <w:t>B3b</w:t>
+            </w:r>
+          </w:p>
+        </w:tc>
+        <w:tc>
+          <w:tcPr>
+            <w:tcW w:type="dxa" w:w="2160"/>
+          </w:tcPr>
+          <w:p>
+            <w:r>
+              <w:rPr>
+                <w:sz w:val="18"/>
+              </w:rPr>
+              <w:t>While GET /packages/registrations/my is loading, Confirm registration is disabled and "Checking your registrations" is shown; handleSubmit also returns early while loading, so a programmatic submit sends nothing. Ready and error keep the round 1 rules (block a pending registration of the same package; block nothing on error).</w:t>
+            </w:r>
+          </w:p>
+        </w:tc>
+        <w:tc>
+          <w:tcPr>
+            <w:tcW w:type="dxa" w:w="2160"/>
+          </w:tcPr>
+          <w:p>
+            <w:r>
+              <w:rPr>
+                <w:sz w:val="18"/>
+              </w:rPr>
+              <w:t>PackageDetailPage.tsx, member.css</w:t>
+            </w:r>
+          </w:p>
+        </w:tc>
+        <w:tc>
+          <w:tcPr>
+            <w:tcW w:type="dxa" w:w="2160"/>
+          </w:tcPr>
+          <w:p>
+            <w:r>
+              <w:rPr>
+                <w:sz w:val="18"/>
+              </w:rPr>
+              <w:t>TC-FE03-052; detail test helpers wait for the list</w:t>
+            </w:r>
+          </w:p>
+        </w:tc>
+      </w:tr>
+      <w:tr>
+        <w:tc>
+          <w:tcPr>
+            <w:tcW w:type="dxa" w:w="2160"/>
+          </w:tcPr>
+          <w:p>
+            <w:r>
+              <w:rPr>
+                <w:sz w:val="18"/>
+              </w:rPr>
+              <w:t>N1</w:t>
+            </w:r>
+          </w:p>
+        </w:tc>
+        <w:tc>
+          <w:tcPr>
+            <w:tcW w:type="dxa" w:w="2160"/>
+          </w:tcPr>
+          <w:p>
+            <w:r>
+              <w:rPr>
+                <w:sz w:val="18"/>
+              </w:rPr>
+              <w:t>While the member cards load, discount-eligible package cards show "-" as the price with "Checking your card discount"; single visit cards keep their price.</w:t>
+            </w:r>
+          </w:p>
+        </w:tc>
+        <w:tc>
+          <w:tcPr>
+            <w:tcW w:type="dxa" w:w="2160"/>
+          </w:tcPr>
+          <w:p>
+            <w:r>
+              <w:rPr>
+                <w:sz w:val="18"/>
+              </w:rPr>
+              <w:t>SportPackagesPage.tsx</w:t>
+            </w:r>
+          </w:p>
+        </w:tc>
+        <w:tc>
+          <w:tcPr>
+            <w:tcW w:type="dxa" w:w="2160"/>
+          </w:tcPr>
+          <w:p>
+            <w:r>
+              <w:rPr>
+                <w:sz w:val="18"/>
+              </w:rPr>
+              <w:t>TC-FE03-048 (extended)</w:t>
+            </w:r>
+          </w:p>
+        </w:tc>
+      </w:tr>
+      <w:tr>
+        <w:tc>
+          <w:tcPr>
+            <w:tcW w:type="dxa" w:w="2160"/>
+          </w:tcPr>
+          <w:p>
+            <w:r>
+              <w:rPr>
+                <w:sz w:val="18"/>
+              </w:rPr>
+              <w:t>N2</w:t>
+            </w:r>
+          </w:p>
+        </w:tc>
+        <w:tc>
+          <w:tcPr>
+            <w:tcW w:type="dxa" w:w="2160"/>
+          </w:tcPr>
+          <w:p>
+            <w:r>
+              <w:rPr>
+                <w:sz w:val="18"/>
+              </w:rPr>
+              <w:t>The first FE-03 commit was reworded to "feat(fe-03): add Sport Packages and Package Registration" with a non-interactive git rebase (reword); author, date and trailers kept.</w:t>
+            </w:r>
+          </w:p>
+        </w:tc>
+        <w:tc>
+          <w:tcPr>
+            <w:tcW w:type="dxa" w:w="2160"/>
+          </w:tcPr>
+          <w:p>
+            <w:r>
+              <w:rPr>
+                <w:sz w:val="18"/>
+              </w:rPr>
+              <w:t>git history</w:t>
+            </w:r>
+          </w:p>
+        </w:tc>
+        <w:tc>
+          <w:tcPr>
+            <w:tcW w:type="dxa" w:w="2160"/>
+          </w:tcPr>
+          <w:p>
+            <w:r>
+              <w:rPr>
+                <w:sz w:val="18"/>
+              </w:rPr>
+              <w:t>-</w:t>
+            </w:r>
+          </w:p>
+        </w:tc>
+      </w:tr>
+    </w:tbl>
+    <w:p/>
+    <w:p>
+      <w:pPr>
+        <w:pStyle w:val="Heading2"/>
+      </w:pPr>
+      <w:r>
+        <w:t>9.1 Files changed in review round 2</w:t>
+      </w:r>
+    </w:p>
+    <w:tbl>
+      <w:tblPr>
+        <w:tblStyle w:val="LightGrid-Accent1"/>
+        <w:tblW w:type="auto" w:w="0"/>
+        <w:jc w:val="center"/>
+        <w:tblLook w:firstColumn="1" w:firstRow="1" w:lastColumn="0" w:lastRow="0" w:noHBand="0" w:noVBand="1" w:val="04A0"/>
+      </w:tblPr>
+      <w:tblGrid>
+        <w:gridCol w:w="4320"/>
+        <w:gridCol w:w="4320"/>
+      </w:tblGrid>
+      <w:tr>
+        <w:tc>
+          <w:tcPr>
+            <w:tcW w:type="dxa" w:w="4320"/>
+          </w:tcPr>
+          <w:p>
+            <w:r>
+              <w:rPr>
+                <w:b/>
+                <w:sz w:val="18"/>
+              </w:rPr>
+              <w:t>Path</w:t>
+            </w:r>
+          </w:p>
+        </w:tc>
+        <w:tc>
+          <w:tcPr>
+            <w:tcW w:type="dxa" w:w="4320"/>
+          </w:tcPr>
+          <w:p>
+            <w:r>
+              <w:rPr>
+                <w:b/>
+                <w:sz w:val="18"/>
+              </w:rPr>
+              <w:t>Change</w:t>
+            </w:r>
+          </w:p>
+        </w:tc>
+      </w:tr>
+      <w:tr>
+        <w:tc>
+          <w:tcPr>
+            <w:tcW w:type="dxa" w:w="4320"/>
+          </w:tcPr>
+          <w:p>
+            <w:r>
+              <w:rPr>
+                <w:sz w:val="18"/>
+              </w:rPr>
+              <w:t>CHANGELOG.md</w:t>
+            </w:r>
+          </w:p>
+        </w:tc>
+        <w:tc>
+          <w:tcPr>
+            <w:tcW w:type="dxa" w:w="4320"/>
+          </w:tcPr>
+          <w:p>
+            <w:r>
+              <w:rPr>
+                <w:sz w:val="18"/>
+              </w:rPr>
+              <w:t>Modified: Review round 2 line</w:t>
+            </w:r>
+          </w:p>
+        </w:tc>
+      </w:tr>
+      <w:tr>
+        <w:tc>
+          <w:tcPr>
+            <w:tcW w:type="dxa" w:w="4320"/>
+          </w:tcPr>
+          <w:p>
+            <w:r>
+              <w:rPr>
+                <w:sz w:val="18"/>
+              </w:rPr>
+              <w:t>docs/audit/FE-03_AI_Audit_Log.docx</w:t>
+            </w:r>
+          </w:p>
+        </w:tc>
+        <w:tc>
+          <w:tcPr>
+            <w:tcW w:type="dxa" w:w="4320"/>
+          </w:tcPr>
+          <w:p>
+            <w:r>
+              <w:rPr>
+                <w:sz w:val="18"/>
+              </w:rPr>
+              <w:t>Modified: section 9</w:t>
+            </w:r>
+          </w:p>
+        </w:tc>
+      </w:tr>
+      <w:tr>
+        <w:tc>
+          <w:tcPr>
+            <w:tcW w:type="dxa" w:w="4320"/>
+          </w:tcPr>
+          <w:p>
+            <w:r>
+              <w:rPr>
+                <w:sz w:val="18"/>
+              </w:rPr>
+              <w:t>docs/tests/FE-03_test_cases.md</w:t>
+            </w:r>
+          </w:p>
+        </w:tc>
+        <w:tc>
+          <w:tcPr>
+            <w:tcW w:type="dxa" w:w="4320"/>
+          </w:tcPr>
+          <w:p>
+            <w:r>
+              <w:rPr>
+                <w:sz w:val="18"/>
+              </w:rPr>
+              <w:t>Modified</w:t>
+            </w:r>
+          </w:p>
+        </w:tc>
+      </w:tr>
+      <w:tr>
+        <w:tc>
+          <w:tcPr>
+            <w:tcW w:type="dxa" w:w="4320"/>
+          </w:tcPr>
+          <w:p>
+            <w:r>
+              <w:rPr>
+                <w:sz w:val="18"/>
+              </w:rPr>
+              <w:t>frontend/src/pages/member/PackageDetailPage.tsx</w:t>
+            </w:r>
+          </w:p>
+        </w:tc>
+        <w:tc>
+          <w:tcPr>
+            <w:tcW w:type="dxa" w:w="4320"/>
+          </w:tcPr>
+          <w:p>
+            <w:r>
+              <w:rPr>
+                <w:sz w:val="18"/>
+              </w:rPr>
+              <w:t>Modified</w:t>
+            </w:r>
+          </w:p>
+        </w:tc>
+      </w:tr>
+      <w:tr>
+        <w:tc>
+          <w:tcPr>
+            <w:tcW w:type="dxa" w:w="4320"/>
+          </w:tcPr>
+          <w:p>
+            <w:r>
+              <w:rPr>
+                <w:sz w:val="18"/>
+              </w:rPr>
+              <w:t>frontend/src/pages/member/SportPackagesPage.tsx</w:t>
+            </w:r>
+          </w:p>
+        </w:tc>
+        <w:tc>
+          <w:tcPr>
+            <w:tcW w:type="dxa" w:w="4320"/>
+          </w:tcPr>
+          <w:p>
+            <w:r>
+              <w:rPr>
+                <w:sz w:val="18"/>
+              </w:rPr>
+              <w:t>Modified</w:t>
+            </w:r>
+          </w:p>
+        </w:tc>
+      </w:tr>
+      <w:tr>
+        <w:tc>
+          <w:tcPr>
+            <w:tcW w:type="dxa" w:w="4320"/>
+          </w:tcPr>
+          <w:p>
+            <w:r>
+              <w:rPr>
+                <w:sz w:val="18"/>
+              </w:rPr>
+              <w:t>frontend/src/pages/member/sportPackages.test.tsx</w:t>
+            </w:r>
+          </w:p>
+        </w:tc>
+        <w:tc>
+          <w:tcPr>
+            <w:tcW w:type="dxa" w:w="4320"/>
+          </w:tcPr>
+          <w:p>
+            <w:r>
+              <w:rPr>
+                <w:sz w:val="18"/>
+              </w:rPr>
+              <w:t>Modified</w:t>
+            </w:r>
+          </w:p>
+        </w:tc>
+      </w:tr>
+      <w:tr>
+        <w:tc>
+          <w:tcPr>
+            <w:tcW w:type="dxa" w:w="4320"/>
+          </w:tcPr>
+          <w:p>
+            <w:r>
+              <w:rPr>
+                <w:sz w:val="18"/>
+              </w:rPr>
+              <w:t>frontend/src/styles/member.css</w:t>
+            </w:r>
+          </w:p>
+        </w:tc>
+        <w:tc>
+          <w:tcPr>
+            <w:tcW w:type="dxa" w:w="4320"/>
+          </w:tcPr>
+          <w:p>
+            <w:r>
+              <w:rPr>
+                <w:sz w:val="18"/>
+              </w:rPr>
+              <w:t>Modified</w:t>
+            </w:r>
+          </w:p>
+        </w:tc>
+      </w:tr>
+    </w:tbl>
+    <w:p/>
+    <w:p>
+      <w:r>
+        <w:t>Character scan of every changed file (code, Markdown and this docx): no non ASCII characters.</w:t>
+      </w:r>
+    </w:p>
     <w:sectPr>
       <w:pgSz w:w="12240" w:h="15840"/>
       <w:pgMar w:top="1440" w:right="1800" w:bottom="1440" w:left="1800" w:header="720" w:footer="720" w:gutter="0"/>

</xml_diff>